<commit_message>
Modernize app UI and profile experience with M8 study verification
Add responsive navigation, adaptive product and pantry layouts, ingredient details, shared styling, and portrait refinements. Preserve source provenance and add UI and profile regression coverage. Record the frozen study product set and controlled-mode verification status.
</commit_message>
<xml_diff>
--- a/docs/testing/Food_Nutrition_Application_User_Test_Procedure.docx
+++ b/docs/testing/Food_Nutrition_Application_User_Test_Procedure.docx
@@ -23,6 +23,7 @@
       <w:tr>
         <w:trPr>
           <w:jc w:val="center"/>
+          <w:cantSplit/>
         </w:trPr>
         <w:tc>
           <w:tcPr>
@@ -99,6 +100,7 @@
       <w:tr>
         <w:trPr>
           <w:jc w:val="center"/>
+          <w:cantSplit/>
         </w:trPr>
         <w:tc>
           <w:tcPr>
@@ -200,6 +202,7 @@
       <w:tr>
         <w:trPr>
           <w:jc w:val="center"/>
+          <w:cantSplit/>
         </w:trPr>
         <w:tc>
           <w:tcPr>
@@ -321,13 +324,7 @@
     </w:p>
     <w:p>
       <w:r>
-        <w:rPr>
-          <w:b/>
-        </w:rPr>
-        <w:t xml:space="preserve">Protocol version: </w:t>
-      </w:r>
-      <w:r>
-        <w:t>1.0 · August 7, 2026</w:t>
+        <w:t>Protocol version: 1.2 | September 8, 2026</w:t>
       </w:r>
     </w:p>
     <w:p>
@@ -443,6 +440,7 @@
         <w:trPr>
           <w:tblHeader/>
           <w:jc w:val="center"/>
+          <w:cantSplit/>
         </w:trPr>
         <w:tc>
           <w:tcPr>
@@ -526,6 +524,7 @@
       <w:tr>
         <w:trPr>
           <w:jc w:val="center"/>
+          <w:cantSplit/>
         </w:trPr>
         <w:tc>
           <w:tcPr>
@@ -600,6 +599,7 @@
       <w:tr>
         <w:trPr>
           <w:jc w:val="center"/>
+          <w:cantSplit/>
         </w:trPr>
         <w:tc>
           <w:tcPr>
@@ -677,6 +677,7 @@
       <w:tr>
         <w:trPr>
           <w:jc w:val="center"/>
+          <w:cantSplit/>
         </w:trPr>
         <w:tc>
           <w:tcPr>
@@ -875,7 +876,7 @@
         <w:ind w:left="540" w:hanging="271"/>
       </w:pPr>
       <w:r>
-        <w:t>Confirm the exact UPC for each product and freeze the product list; do not substitute items after participant testing begins.</w:t>
+        <w:t>Confirm that every physical package matches the exact product name, size, and frozen UPC in Section 5. Quarantine any mismatch; do not substitute products after participant testing begins.</w:t>
       </w:r>
     </w:p>
     <w:p>
@@ -939,7 +940,7 @@
     </w:p>
     <w:p>
       <w:r>
-        <w:t>Use the exact package size and UPC recorded before the first participant session. If an item becomes unavailable, pause data collection and document an approved protocol amendment rather than substituting a product mid-study.</w:t>
+        <w:t>Freeze ID M8-01-2026-09-08: 20 exact packages locked with valid UPC-A identifiers, balanced as 10 expected approved and 10 expected not approved. Expected classifications are facilitator-only screening labels and must not be revealed to participants. Record each app's actual result as observed; treat disagreements and missing results separately from approval. Use products P01-P20 in numerical order for every app. If any frozen package becomes unavailable after testing begins, pause data collection and document an approved protocol amendment before making a replacement. Source evidence is recorded in docs/testing/m8-01-frozen-validation-product-set.md.</w:t>
       </w:r>
     </w:p>
     <w:tbl>
@@ -968,6 +969,7 @@
         <w:trPr>
           <w:tblHeader/>
           <w:jc w:val="center"/>
+          <w:cantSplit/>
         </w:trPr>
         <w:tc>
           <w:tcPr>
@@ -1103,6 +1105,7 @@
       <w:tr>
         <w:trPr>
           <w:jc w:val="center"/>
+          <w:cantSplit/>
         </w:trPr>
         <w:tc>
           <w:tcPr>
@@ -1139,6 +1142,30 @@
             <w:vAlign w:val="center"/>
           </w:tcPr>
           <w:p>
+            <w:r/>
+            <w:hyperlink r:id="rId12">
+              <w:r>
+                <w:rPr>
+                  <w:color w:val="0563C1"/>
+                  <w:u w:val="single"/>
+                </w:rPr>
+                <w:t>Bob's Red Mill Organic Old Fashioned Rolled Oats, 16 oz</w:t>
+              </w:r>
+            </w:hyperlink>
+          </w:p>
+        </w:tc>
+        <w:tc>
+          <w:tcPr>
+            <w:tcW w:w="1550" w:type="dxa"/>
+            <w:tcMar>
+              <w:top w:w="80" w:type="dxa"/>
+              <w:left w:w="120" w:type="dxa"/>
+              <w:bottom w:w="80" w:type="dxa"/>
+              <w:right w:w="120" w:type="dxa"/>
+            </w:tcMar>
+            <w:vAlign w:val="center"/>
+          </w:tcPr>
+          <w:p>
             <w:pPr>
               <w:spacing w:after="40"/>
             </w:pPr>
@@ -1146,13 +1173,13 @@
               <w:rPr>
                 <w:sz w:val="16"/>
               </w:rPr>
-              <w:t>Cheerios Original</w:t>
-            </w:r>
-          </w:p>
-        </w:tc>
-        <w:tc>
-          <w:tcPr>
-            <w:tcW w:w="1550" w:type="dxa"/>
+              <w:t>Hot cereal</w:t>
+            </w:r>
+          </w:p>
+        </w:tc>
+        <w:tc>
+          <w:tcPr>
+            <w:tcW w:w="2760" w:type="dxa"/>
             <w:tcMar>
               <w:top w:w="80" w:type="dxa"/>
               <w:left w:w="120" w:type="dxa"/>
@@ -1169,30 +1196,7 @@
               <w:rPr>
                 <w:sz w:val="16"/>
               </w:rPr>
-              <w:t>Breakfast cereal</w:t>
-            </w:r>
-          </w:p>
-        </w:tc>
-        <w:tc>
-          <w:tcPr>
-            <w:tcW w:w="2760" w:type="dxa"/>
-            <w:tcMar>
-              <w:top w:w="80" w:type="dxa"/>
-              <w:left w:w="120" w:type="dxa"/>
-              <w:bottom w:w="80" w:type="dxa"/>
-              <w:right w:w="120" w:type="dxa"/>
-            </w:tcMar>
-            <w:vAlign w:val="center"/>
-          </w:tcPr>
-          <w:p>
-            <w:pPr>
-              <w:spacing w:after="40"/>
-            </w:pPr>
-            <w:r>
-              <w:rPr>
-                <w:sz w:val="16"/>
-              </w:rPr>
-              <w:t>Baseline grain product</w:t>
+              <w:t>Likely approved; Whole grain / no added sugar</w:t>
             </w:r>
           </w:p>
         </w:tc>
@@ -1208,14 +1212,8 @@
             <w:vAlign w:val="center"/>
           </w:tcPr>
           <w:p>
-            <w:pPr>
-              <w:spacing w:after="40"/>
-            </w:pPr>
-            <w:r>
-              <w:rPr>
-                <w:sz w:val="16"/>
-              </w:rPr>
-              <w:t>Record before study</w:t>
+            <w:r>
+              <w:t>039978039521</w:t>
             </w:r>
           </w:p>
         </w:tc>
@@ -1223,6 +1221,7 @@
       <w:tr>
         <w:trPr>
           <w:jc w:val="center"/>
+          <w:cantSplit/>
         </w:trPr>
         <w:tc>
           <w:tcPr>
@@ -1261,15 +1260,16 @@
             <w:vAlign w:val="center"/>
           </w:tcPr>
           <w:p>
-            <w:pPr>
-              <w:spacing w:after="40"/>
-            </w:pPr>
-            <w:r>
-              <w:rPr>
-                <w:sz w:val="16"/>
-              </w:rPr>
-              <w:t>Honey Nut Cheerios</w:t>
-            </w:r>
+            <w:r/>
+            <w:hyperlink r:id="rId13">
+              <w:r>
+                <w:rPr>
+                  <w:color w:val="0563C1"/>
+                  <w:u w:val="single"/>
+                </w:rPr>
+                <w:t>Honey Nut Cheerios, 10.8 oz</w:t>
+              </w:r>
+            </w:hyperlink>
           </w:p>
         </w:tc>
         <w:tc>
@@ -1316,7 +1316,7 @@
               <w:rPr>
                 <w:sz w:val="16"/>
               </w:rPr>
-              <w:t>Added sugar / flavoring</w:t>
+              <w:t>Likely not approved; Added sugar / flavoring</w:t>
             </w:r>
           </w:p>
         </w:tc>
@@ -1333,14 +1333,8 @@
             <w:vAlign w:val="center"/>
           </w:tcPr>
           <w:p>
-            <w:pPr>
-              <w:spacing w:after="40"/>
-            </w:pPr>
-            <w:r>
-              <w:rPr>
-                <w:sz w:val="16"/>
-              </w:rPr>
-              <w:t>Record before study</w:t>
+            <w:r>
+              <w:t>016000124790</w:t>
             </w:r>
           </w:p>
         </w:tc>
@@ -1348,6 +1342,7 @@
       <w:tr>
         <w:trPr>
           <w:jc w:val="center"/>
+          <w:cantSplit/>
         </w:trPr>
         <w:tc>
           <w:tcPr>
@@ -1384,6 +1379,30 @@
             <w:vAlign w:val="center"/>
           </w:tcPr>
           <w:p>
+            <w:r/>
+            <w:hyperlink r:id="rId14">
+              <w:r>
+                <w:rPr>
+                  <w:color w:val="0563C1"/>
+                  <w:u w:val="single"/>
+                </w:rPr>
+                <w:t>Kellogg's Frosted Flakes, 13.5 oz</w:t>
+              </w:r>
+            </w:hyperlink>
+          </w:p>
+        </w:tc>
+        <w:tc>
+          <w:tcPr>
+            <w:tcW w:w="1550" w:type="dxa"/>
+            <w:tcMar>
+              <w:top w:w="80" w:type="dxa"/>
+              <w:left w:w="120" w:type="dxa"/>
+              <w:bottom w:w="80" w:type="dxa"/>
+              <w:right w:w="120" w:type="dxa"/>
+            </w:tcMar>
+            <w:vAlign w:val="center"/>
+          </w:tcPr>
+          <w:p>
             <w:pPr>
               <w:spacing w:after="40"/>
             </w:pPr>
@@ -1391,13 +1410,13 @@
               <w:rPr>
                 <w:sz w:val="16"/>
               </w:rPr>
-              <w:t>Kellogg's Frosted Flakes</w:t>
-            </w:r>
-          </w:p>
-        </w:tc>
-        <w:tc>
-          <w:tcPr>
-            <w:tcW w:w="1550" w:type="dxa"/>
+              <w:t>Breakfast cereal</w:t>
+            </w:r>
+          </w:p>
+        </w:tc>
+        <w:tc>
+          <w:tcPr>
+            <w:tcW w:w="2760" w:type="dxa"/>
             <w:tcMar>
               <w:top w:w="80" w:type="dxa"/>
               <w:left w:w="120" w:type="dxa"/>
@@ -1414,30 +1433,7 @@
               <w:rPr>
                 <w:sz w:val="16"/>
               </w:rPr>
-              <w:t>Breakfast cereal</w:t>
-            </w:r>
-          </w:p>
-        </w:tc>
-        <w:tc>
-          <w:tcPr>
-            <w:tcW w:w="2760" w:type="dxa"/>
-            <w:tcMar>
-              <w:top w:w="80" w:type="dxa"/>
-              <w:left w:w="120" w:type="dxa"/>
-              <w:bottom w:w="80" w:type="dxa"/>
-              <w:right w:w="120" w:type="dxa"/>
-            </w:tcMar>
-            <w:vAlign w:val="center"/>
-          </w:tcPr>
-          <w:p>
-            <w:pPr>
-              <w:spacing w:after="40"/>
-            </w:pPr>
-            <w:r>
-              <w:rPr>
-                <w:sz w:val="16"/>
-              </w:rPr>
-              <w:t>Higher added sugar</w:t>
+              <w:t>Likely not approved; Higher added sugar</w:t>
             </w:r>
           </w:p>
         </w:tc>
@@ -1453,14 +1449,8 @@
             <w:vAlign w:val="center"/>
           </w:tcPr>
           <w:p>
-            <w:pPr>
-              <w:spacing w:after="40"/>
-            </w:pPr>
-            <w:r>
-              <w:rPr>
-                <w:sz w:val="16"/>
-              </w:rPr>
-              <w:t>Record before study</w:t>
+            <w:r>
+              <w:t>038000199042</w:t>
             </w:r>
           </w:p>
         </w:tc>
@@ -1468,6 +1458,7 @@
       <w:tr>
         <w:trPr>
           <w:jc w:val="center"/>
+          <w:cantSplit/>
         </w:trPr>
         <w:tc>
           <w:tcPr>
@@ -1506,15 +1497,16 @@
             <w:vAlign w:val="center"/>
           </w:tcPr>
           <w:p>
-            <w:pPr>
-              <w:spacing w:after="40"/>
-            </w:pPr>
-            <w:r>
-              <w:rPr>
-                <w:sz w:val="16"/>
-              </w:rPr>
-              <w:t>Quaker Instant Oatmeal Original</w:t>
-            </w:r>
+            <w:r/>
+            <w:hyperlink r:id="rId15">
+              <w:r>
+                <w:rPr>
+                  <w:color w:val="0563C1"/>
+                  <w:u w:val="single"/>
+                </w:rPr>
+                <w:t>Quaker Instant Oatmeal Original, 10 packets / 9.8 oz</w:t>
+              </w:r>
+            </w:hyperlink>
           </w:p>
         </w:tc>
         <w:tc>
@@ -1561,7 +1553,7 @@
               <w:rPr>
                 <w:sz w:val="16"/>
               </w:rPr>
-              <w:t>Short ingredient list</w:t>
+              <w:t>Likely approved; Short ingredient list</w:t>
             </w:r>
           </w:p>
         </w:tc>
@@ -1578,14 +1570,8 @@
             <w:vAlign w:val="center"/>
           </w:tcPr>
           <w:p>
-            <w:pPr>
-              <w:spacing w:after="40"/>
-            </w:pPr>
-            <w:r>
-              <w:rPr>
-                <w:sz w:val="16"/>
-              </w:rPr>
-              <w:t>Record before study</w:t>
+            <w:r>
+              <w:t>030000567319</w:t>
             </w:r>
           </w:p>
         </w:tc>
@@ -1593,6 +1579,7 @@
       <w:tr>
         <w:trPr>
           <w:jc w:val="center"/>
+          <w:cantSplit/>
         </w:trPr>
         <w:tc>
           <w:tcPr>
@@ -1629,6 +1616,30 @@
             <w:vAlign w:val="center"/>
           </w:tcPr>
           <w:p>
+            <w:r/>
+            <w:hyperlink r:id="rId16">
+              <w:r>
+                <w:rPr>
+                  <w:color w:val="0563C1"/>
+                  <w:u w:val="single"/>
+                </w:rPr>
+                <w:t>Coca-Cola Original Taste, 20 fl oz bottle</w:t>
+              </w:r>
+            </w:hyperlink>
+          </w:p>
+        </w:tc>
+        <w:tc>
+          <w:tcPr>
+            <w:tcW w:w="1550" w:type="dxa"/>
+            <w:tcMar>
+              <w:top w:w="80" w:type="dxa"/>
+              <w:left w:w="120" w:type="dxa"/>
+              <w:bottom w:w="80" w:type="dxa"/>
+              <w:right w:w="120" w:type="dxa"/>
+            </w:tcMar>
+            <w:vAlign w:val="center"/>
+          </w:tcPr>
+          <w:p>
             <w:pPr>
               <w:spacing w:after="40"/>
             </w:pPr>
@@ -1636,13 +1647,13 @@
               <w:rPr>
                 <w:sz w:val="16"/>
               </w:rPr>
-              <w:t>Coca-Cola Original Taste</w:t>
-            </w:r>
-          </w:p>
-        </w:tc>
-        <w:tc>
-          <w:tcPr>
-            <w:tcW w:w="1550" w:type="dxa"/>
+              <w:t>Beverage</w:t>
+            </w:r>
+          </w:p>
+        </w:tc>
+        <w:tc>
+          <w:tcPr>
+            <w:tcW w:w="2760" w:type="dxa"/>
             <w:tcMar>
               <w:top w:w="80" w:type="dxa"/>
               <w:left w:w="120" w:type="dxa"/>
@@ -1659,30 +1670,7 @@
               <w:rPr>
                 <w:sz w:val="16"/>
               </w:rPr>
-              <w:t>Beverage</w:t>
-            </w:r>
-          </w:p>
-        </w:tc>
-        <w:tc>
-          <w:tcPr>
-            <w:tcW w:w="2760" w:type="dxa"/>
-            <w:tcMar>
-              <w:top w:w="80" w:type="dxa"/>
-              <w:left w:w="120" w:type="dxa"/>
-              <w:bottom w:w="80" w:type="dxa"/>
-              <w:right w:w="120" w:type="dxa"/>
-            </w:tcMar>
-            <w:vAlign w:val="center"/>
-          </w:tcPr>
-          <w:p>
-            <w:pPr>
-              <w:spacing w:after="40"/>
-            </w:pPr>
-            <w:r>
-              <w:rPr>
-                <w:sz w:val="16"/>
-              </w:rPr>
-              <w:t>Sugar-sweetened beverage</w:t>
+              <w:t>Likely not approved; Sugar-sweetened beverage</w:t>
             </w:r>
           </w:p>
         </w:tc>
@@ -1698,14 +1686,8 @@
             <w:vAlign w:val="center"/>
           </w:tcPr>
           <w:p>
-            <w:pPr>
-              <w:spacing w:after="40"/>
-            </w:pPr>
-            <w:r>
-              <w:rPr>
-                <w:sz w:val="16"/>
-              </w:rPr>
-              <w:t>Record before study</w:t>
+            <w:r>
+              <w:t>049000000443</w:t>
             </w:r>
           </w:p>
         </w:tc>
@@ -1713,6 +1695,7 @@
       <w:tr>
         <w:trPr>
           <w:jc w:val="center"/>
+          <w:cantSplit/>
         </w:trPr>
         <w:tc>
           <w:tcPr>
@@ -1751,15 +1734,16 @@
             <w:vAlign w:val="center"/>
           </w:tcPr>
           <w:p>
-            <w:pPr>
-              <w:spacing w:after="40"/>
-            </w:pPr>
-            <w:r>
-              <w:rPr>
-                <w:sz w:val="16"/>
-              </w:rPr>
-              <w:t>Diet Coke</w:t>
-            </w:r>
+            <w:r/>
+            <w:hyperlink r:id="rId17">
+              <w:r>
+                <w:rPr>
+                  <w:color w:val="0563C1"/>
+                  <w:u w:val="single"/>
+                </w:rPr>
+                <w:t>Diet Coke, 20 fl oz bottle</w:t>
+              </w:r>
+            </w:hyperlink>
           </w:p>
         </w:tc>
         <w:tc>
@@ -1806,7 +1790,7 @@
               <w:rPr>
                 <w:sz w:val="16"/>
               </w:rPr>
-              <w:t>Non-sugar sweeteners</w:t>
+              <w:t>Likely not approved; Non-sugar sweeteners</w:t>
             </w:r>
           </w:p>
         </w:tc>
@@ -1823,14 +1807,8 @@
             <w:vAlign w:val="center"/>
           </w:tcPr>
           <w:p>
-            <w:pPr>
-              <w:spacing w:after="40"/>
-            </w:pPr>
-            <w:r>
-              <w:rPr>
-                <w:sz w:val="16"/>
-              </w:rPr>
-              <w:t>Record before study</w:t>
+            <w:r>
+              <w:t>049000000450</w:t>
             </w:r>
           </w:p>
         </w:tc>
@@ -1838,6 +1816,7 @@
       <w:tr>
         <w:trPr>
           <w:jc w:val="center"/>
+          <w:cantSplit/>
         </w:trPr>
         <w:tc>
           <w:tcPr>
@@ -1874,6 +1853,30 @@
             <w:vAlign w:val="center"/>
           </w:tcPr>
           <w:p>
+            <w:r/>
+            <w:hyperlink r:id="rId18">
+              <w:r>
+                <w:rPr>
+                  <w:color w:val="0563C1"/>
+                  <w:u w:val="single"/>
+                </w:rPr>
+                <w:t>Gatorade Lemon-Lime, 28 fl oz bottle</w:t>
+              </w:r>
+            </w:hyperlink>
+          </w:p>
+        </w:tc>
+        <w:tc>
+          <w:tcPr>
+            <w:tcW w:w="1550" w:type="dxa"/>
+            <w:tcMar>
+              <w:top w:w="80" w:type="dxa"/>
+              <w:left w:w="120" w:type="dxa"/>
+              <w:bottom w:w="80" w:type="dxa"/>
+              <w:right w:w="120" w:type="dxa"/>
+            </w:tcMar>
+            <w:vAlign w:val="center"/>
+          </w:tcPr>
+          <w:p>
             <w:pPr>
               <w:spacing w:after="40"/>
             </w:pPr>
@@ -1881,13 +1884,13 @@
               <w:rPr>
                 <w:sz w:val="16"/>
               </w:rPr>
-              <w:t>Gatorade Lemon-Lime</w:t>
-            </w:r>
-          </w:p>
-        </w:tc>
-        <w:tc>
-          <w:tcPr>
-            <w:tcW w:w="1550" w:type="dxa"/>
+              <w:t>Sports drink</w:t>
+            </w:r>
+          </w:p>
+        </w:tc>
+        <w:tc>
+          <w:tcPr>
+            <w:tcW w:w="2760" w:type="dxa"/>
             <w:tcMar>
               <w:top w:w="80" w:type="dxa"/>
               <w:left w:w="120" w:type="dxa"/>
@@ -1904,30 +1907,7 @@
               <w:rPr>
                 <w:sz w:val="16"/>
               </w:rPr>
-              <w:t>Sports drink</w:t>
-            </w:r>
-          </w:p>
-        </w:tc>
-        <w:tc>
-          <w:tcPr>
-            <w:tcW w:w="2760" w:type="dxa"/>
-            <w:tcMar>
-              <w:top w:w="80" w:type="dxa"/>
-              <w:left w:w="120" w:type="dxa"/>
-              <w:bottom w:w="80" w:type="dxa"/>
-              <w:right w:w="120" w:type="dxa"/>
-            </w:tcMar>
-            <w:vAlign w:val="center"/>
-          </w:tcPr>
-          <w:p>
-            <w:pPr>
-              <w:spacing w:after="40"/>
-            </w:pPr>
-            <w:r>
-              <w:rPr>
-                <w:sz w:val="16"/>
-              </w:rPr>
-              <w:t>Color / electrolytes</w:t>
+              <w:t>Likely not approved; Color / electrolytes</w:t>
             </w:r>
           </w:p>
         </w:tc>
@@ -1943,14 +1923,8 @@
             <w:vAlign w:val="center"/>
           </w:tcPr>
           <w:p>
-            <w:pPr>
-              <w:spacing w:after="40"/>
-            </w:pPr>
-            <w:r>
-              <w:rPr>
-                <w:sz w:val="16"/>
-              </w:rPr>
-              <w:t>Record before study</w:t>
+            <w:r>
+              <w:t>052000135152</w:t>
             </w:r>
           </w:p>
         </w:tc>
@@ -1958,6 +1932,7 @@
       <w:tr>
         <w:trPr>
           <w:jc w:val="center"/>
+          <w:cantSplit/>
         </w:trPr>
         <w:tc>
           <w:tcPr>
@@ -1996,15 +1971,16 @@
             <w:vAlign w:val="center"/>
           </w:tcPr>
           <w:p>
-            <w:pPr>
-              <w:spacing w:after="40"/>
-            </w:pPr>
-            <w:r>
-              <w:rPr>
-                <w:sz w:val="16"/>
-              </w:rPr>
-              <w:t>Chobani Plain Non-Fat Greek Yogurt</w:t>
-            </w:r>
+            <w:r/>
+            <w:hyperlink r:id="rId19">
+              <w:r>
+                <w:rPr>
+                  <w:color w:val="0563C1"/>
+                  <w:u w:val="single"/>
+                </w:rPr>
+                <w:t>Chobani Plain Non-Fat Greek Yogurt, 32 oz tub</w:t>
+              </w:r>
+            </w:hyperlink>
           </w:p>
         </w:tc>
         <w:tc>
@@ -2051,7 +2027,7 @@
               <w:rPr>
                 <w:sz w:val="16"/>
               </w:rPr>
-              <w:t>Protein-focused product</w:t>
+              <w:t>Likely approved; Protein-focused product</w:t>
             </w:r>
           </w:p>
         </w:tc>
@@ -2068,14 +2044,8 @@
             <w:vAlign w:val="center"/>
           </w:tcPr>
           <w:p>
-            <w:pPr>
-              <w:spacing w:after="40"/>
-            </w:pPr>
-            <w:r>
-              <w:rPr>
-                <w:sz w:val="16"/>
-              </w:rPr>
-              <w:t>Record before study</w:t>
+            <w:r>
+              <w:t>894700010137</w:t>
             </w:r>
           </w:p>
         </w:tc>
@@ -2083,6 +2053,7 @@
       <w:tr>
         <w:trPr>
           <w:jc w:val="center"/>
+          <w:cantSplit/>
         </w:trPr>
         <w:tc>
           <w:tcPr>
@@ -2119,6 +2090,30 @@
             <w:vAlign w:val="center"/>
           </w:tcPr>
           <w:p>
+            <w:r/>
+            <w:hyperlink r:id="rId20">
+              <w:r>
+                <w:rPr>
+                  <w:color w:val="0563C1"/>
+                  <w:u w:val="single"/>
+                </w:rPr>
+                <w:t>Yoplait Original Strawberry Yogurt, 6 oz cup</w:t>
+              </w:r>
+            </w:hyperlink>
+          </w:p>
+        </w:tc>
+        <w:tc>
+          <w:tcPr>
+            <w:tcW w:w="1550" w:type="dxa"/>
+            <w:tcMar>
+              <w:top w:w="80" w:type="dxa"/>
+              <w:left w:w="120" w:type="dxa"/>
+              <w:bottom w:w="80" w:type="dxa"/>
+              <w:right w:w="120" w:type="dxa"/>
+            </w:tcMar>
+            <w:vAlign w:val="center"/>
+          </w:tcPr>
+          <w:p>
             <w:pPr>
               <w:spacing w:after="40"/>
             </w:pPr>
@@ -2126,13 +2121,13 @@
               <w:rPr>
                 <w:sz w:val="16"/>
               </w:rPr>
-              <w:t>Yoplait Original Strawberry Yogurt</w:t>
-            </w:r>
-          </w:p>
-        </w:tc>
-        <w:tc>
-          <w:tcPr>
-            <w:tcW w:w="1550" w:type="dxa"/>
+              <w:t>Dairy</w:t>
+            </w:r>
+          </w:p>
+        </w:tc>
+        <w:tc>
+          <w:tcPr>
+            <w:tcW w:w="2760" w:type="dxa"/>
             <w:tcMar>
               <w:top w:w="80" w:type="dxa"/>
               <w:left w:w="120" w:type="dxa"/>
@@ -2149,30 +2144,7 @@
               <w:rPr>
                 <w:sz w:val="16"/>
               </w:rPr>
-              <w:t>Dairy</w:t>
-            </w:r>
-          </w:p>
-        </w:tc>
-        <w:tc>
-          <w:tcPr>
-            <w:tcW w:w="2760" w:type="dxa"/>
-            <w:tcMar>
-              <w:top w:w="80" w:type="dxa"/>
-              <w:left w:w="120" w:type="dxa"/>
-              <w:bottom w:w="80" w:type="dxa"/>
-              <w:right w:w="120" w:type="dxa"/>
-            </w:tcMar>
-            <w:vAlign w:val="center"/>
-          </w:tcPr>
-          <w:p>
-            <w:pPr>
-              <w:spacing w:after="40"/>
-            </w:pPr>
-            <w:r>
-              <w:rPr>
-                <w:sz w:val="16"/>
-              </w:rPr>
-              <w:t>Added sugar / flavoring</w:t>
+              <w:t>Likely not approved; Added sugar / flavoring</w:t>
             </w:r>
           </w:p>
         </w:tc>
@@ -2188,14 +2160,8 @@
             <w:vAlign w:val="center"/>
           </w:tcPr>
           <w:p>
-            <w:pPr>
-              <w:spacing w:after="40"/>
-            </w:pPr>
-            <w:r>
-              <w:rPr>
-                <w:sz w:val="16"/>
-              </w:rPr>
-              <w:t>Record before study</w:t>
+            <w:r>
+              <w:t>070470003009</w:t>
             </w:r>
           </w:p>
         </w:tc>
@@ -2203,6 +2169,7 @@
       <w:tr>
         <w:trPr>
           <w:jc w:val="center"/>
+          <w:cantSplit/>
         </w:trPr>
         <w:tc>
           <w:tcPr>
@@ -2242,15 +2209,16 @@
             <w:vAlign w:val="center"/>
           </w:tcPr>
           <w:p>
-            <w:pPr>
-              <w:spacing w:after="40"/>
-            </w:pPr>
-            <w:r>
-              <w:rPr>
-                <w:sz w:val="16"/>
-              </w:rPr>
-              <w:t>Jif Creamy Peanut Butter</w:t>
-            </w:r>
+            <w:r/>
+            <w:hyperlink r:id="rId21">
+              <w:r>
+                <w:rPr>
+                  <w:color w:val="0563C1"/>
+                  <w:u w:val="single"/>
+                </w:rPr>
+                <w:t>Smucker's Natural Creamy Peanut Butter, 16 oz jar</w:t>
+              </w:r>
+            </w:hyperlink>
           </w:p>
         </w:tc>
         <w:tc>
@@ -2297,7 +2265,7 @@
               <w:rPr>
                 <w:sz w:val="16"/>
               </w:rPr>
-              <w:t>Added ingredients</w:t>
+              <w:t>Likely approved; Peanuts and salt / no added sugar</w:t>
             </w:r>
           </w:p>
         </w:tc>
@@ -2314,14 +2282,8 @@
             <w:vAlign w:val="center"/>
           </w:tcPr>
           <w:p>
-            <w:pPr>
-              <w:spacing w:after="40"/>
-            </w:pPr>
-            <w:r>
-              <w:rPr>
-                <w:sz w:val="16"/>
-              </w:rPr>
-              <w:t>Record before study</w:t>
+            <w:r>
+              <w:t>051500017005</w:t>
             </w:r>
           </w:p>
         </w:tc>
@@ -2329,6 +2291,7 @@
       <w:tr>
         <w:trPr>
           <w:jc w:val="center"/>
+          <w:cantSplit/>
         </w:trPr>
         <w:tc>
           <w:tcPr>
@@ -2365,6 +2328,30 @@
             <w:vAlign w:val="center"/>
           </w:tcPr>
           <w:p>
+            <w:r/>
+            <w:hyperlink r:id="rId22">
+              <w:r>
+                <w:rPr>
+                  <w:color w:val="0563C1"/>
+                  <w:u w:val="single"/>
+                </w:rPr>
+                <w:t>Blue Diamond Whole Natural Almonds, 1.5 oz bag</w:t>
+              </w:r>
+            </w:hyperlink>
+          </w:p>
+        </w:tc>
+        <w:tc>
+          <w:tcPr>
+            <w:tcW w:w="1550" w:type="dxa"/>
+            <w:tcMar>
+              <w:top w:w="80" w:type="dxa"/>
+              <w:left w:w="120" w:type="dxa"/>
+              <w:bottom w:w="80" w:type="dxa"/>
+              <w:right w:w="120" w:type="dxa"/>
+            </w:tcMar>
+            <w:vAlign w:val="center"/>
+          </w:tcPr>
+          <w:p>
             <w:pPr>
               <w:spacing w:after="40"/>
             </w:pPr>
@@ -2372,13 +2359,13 @@
               <w:rPr>
                 <w:sz w:val="16"/>
               </w:rPr>
-              <w:t>Skippy Creamy Peanut Butter</w:t>
-            </w:r>
-          </w:p>
-        </w:tc>
-        <w:tc>
-          <w:tcPr>
-            <w:tcW w:w="1550" w:type="dxa"/>
+              <w:t>Nuts</w:t>
+            </w:r>
+          </w:p>
+        </w:tc>
+        <w:tc>
+          <w:tcPr>
+            <w:tcW w:w="2760" w:type="dxa"/>
             <w:tcMar>
               <w:top w:w="80" w:type="dxa"/>
               <w:left w:w="120" w:type="dxa"/>
@@ -2395,30 +2382,7 @@
               <w:rPr>
                 <w:sz w:val="16"/>
               </w:rPr>
-              <w:t>Spread</w:t>
-            </w:r>
-          </w:p>
-        </w:tc>
-        <w:tc>
-          <w:tcPr>
-            <w:tcW w:w="2760" w:type="dxa"/>
-            <w:tcMar>
-              <w:top w:w="80" w:type="dxa"/>
-              <w:left w:w="120" w:type="dxa"/>
-              <w:bottom w:w="80" w:type="dxa"/>
-              <w:right w:w="120" w:type="dxa"/>
-            </w:tcMar>
-            <w:vAlign w:val="center"/>
-          </w:tcPr>
-          <w:p>
-            <w:pPr>
-              <w:spacing w:after="40"/>
-            </w:pPr>
-            <w:r>
-              <w:rPr>
-                <w:sz w:val="16"/>
-              </w:rPr>
-              <w:t>Cross-brand comparison</w:t>
+              <w:t>Likely approved; Plain nuts / short ingredient list</w:t>
             </w:r>
           </w:p>
         </w:tc>
@@ -2434,14 +2398,8 @@
             <w:vAlign w:val="center"/>
           </w:tcPr>
           <w:p>
-            <w:pPr>
-              <w:spacing w:after="40"/>
-            </w:pPr>
-            <w:r>
-              <w:rPr>
-                <w:sz w:val="16"/>
-              </w:rPr>
-              <w:t>Record before study</w:t>
+            <w:r>
+              <w:t>041570051818</w:t>
             </w:r>
           </w:p>
         </w:tc>
@@ -2449,6 +2407,7 @@
       <w:tr>
         <w:trPr>
           <w:jc w:val="center"/>
+          <w:cantSplit/>
         </w:trPr>
         <w:tc>
           <w:tcPr>
@@ -2487,15 +2446,16 @@
             <w:vAlign w:val="center"/>
           </w:tcPr>
           <w:p>
-            <w:pPr>
-              <w:spacing w:after="40"/>
-            </w:pPr>
-            <w:r>
-              <w:rPr>
-                <w:sz w:val="16"/>
-              </w:rPr>
-              <w:t>Lay's Classic Potato Chips</w:t>
-            </w:r>
+            <w:r/>
+            <w:hyperlink r:id="rId23">
+              <w:r>
+                <w:rPr>
+                  <w:color w:val="0563C1"/>
+                  <w:u w:val="single"/>
+                </w:rPr>
+                <w:t>Lundberg Organic Brown Rice Cakes Lightly Salted, 8.5 oz</w:t>
+              </w:r>
+            </w:hyperlink>
           </w:p>
         </w:tc>
         <w:tc>
@@ -2542,7 +2502,7 @@
               <w:rPr>
                 <w:sz w:val="16"/>
               </w:rPr>
-              <w:t>Sodium / simple formulation</w:t>
+              <w:t>Likely approved; Whole grain / simple formulation</w:t>
             </w:r>
           </w:p>
         </w:tc>
@@ -2559,14 +2519,8 @@
             <w:vAlign w:val="center"/>
           </w:tcPr>
           <w:p>
-            <w:pPr>
-              <w:spacing w:after="40"/>
-            </w:pPr>
-            <w:r>
-              <w:rPr>
-                <w:sz w:val="16"/>
-              </w:rPr>
-              <w:t>Record before study</w:t>
+            <w:r>
+              <w:t>073416000148</w:t>
             </w:r>
           </w:p>
         </w:tc>
@@ -2574,6 +2528,7 @@
       <w:tr>
         <w:trPr>
           <w:jc w:val="center"/>
+          <w:cantSplit/>
         </w:trPr>
         <w:tc>
           <w:tcPr>
@@ -2610,6 +2565,30 @@
             <w:vAlign w:val="center"/>
           </w:tcPr>
           <w:p>
+            <w:r/>
+            <w:hyperlink r:id="rId24">
+              <w:r>
+                <w:rPr>
+                  <w:color w:val="0563C1"/>
+                  <w:u w:val="single"/>
+                </w:rPr>
+                <w:t>Doritos Nacho Cheese Tortilla Chips, 9.25 oz</w:t>
+              </w:r>
+            </w:hyperlink>
+          </w:p>
+        </w:tc>
+        <w:tc>
+          <w:tcPr>
+            <w:tcW w:w="1550" w:type="dxa"/>
+            <w:tcMar>
+              <w:top w:w="80" w:type="dxa"/>
+              <w:left w:w="120" w:type="dxa"/>
+              <w:bottom w:w="80" w:type="dxa"/>
+              <w:right w:w="120" w:type="dxa"/>
+            </w:tcMar>
+            <w:vAlign w:val="center"/>
+          </w:tcPr>
+          <w:p>
             <w:pPr>
               <w:spacing w:after="40"/>
             </w:pPr>
@@ -2617,13 +2596,13 @@
               <w:rPr>
                 <w:sz w:val="16"/>
               </w:rPr>
-              <w:t>Doritos Nacho Cheese</w:t>
-            </w:r>
-          </w:p>
-        </w:tc>
-        <w:tc>
-          <w:tcPr>
-            <w:tcW w:w="1550" w:type="dxa"/>
+              <w:t>Snack</w:t>
+            </w:r>
+          </w:p>
+        </w:tc>
+        <w:tc>
+          <w:tcPr>
+            <w:tcW w:w="2760" w:type="dxa"/>
             <w:tcMar>
               <w:top w:w="80" w:type="dxa"/>
               <w:left w:w="120" w:type="dxa"/>
@@ -2640,30 +2619,7 @@
               <w:rPr>
                 <w:sz w:val="16"/>
               </w:rPr>
-              <w:t>Snack</w:t>
-            </w:r>
-          </w:p>
-        </w:tc>
-        <w:tc>
-          <w:tcPr>
-            <w:tcW w:w="2760" w:type="dxa"/>
-            <w:tcMar>
-              <w:top w:w="80" w:type="dxa"/>
-              <w:left w:w="120" w:type="dxa"/>
-              <w:bottom w:w="80" w:type="dxa"/>
-              <w:right w:w="120" w:type="dxa"/>
-            </w:tcMar>
-            <w:vAlign w:val="center"/>
-          </w:tcPr>
-          <w:p>
-            <w:pPr>
-              <w:spacing w:after="40"/>
-            </w:pPr>
-            <w:r>
-              <w:rPr>
-                <w:sz w:val="16"/>
-              </w:rPr>
-              <w:t>Complex ingredient list</w:t>
+              <w:t>Likely not approved; Complex ingredient list</w:t>
             </w:r>
           </w:p>
         </w:tc>
@@ -2679,14 +2635,8 @@
             <w:vAlign w:val="center"/>
           </w:tcPr>
           <w:p>
-            <w:pPr>
-              <w:spacing w:after="40"/>
-            </w:pPr>
-            <w:r>
-              <w:rPr>
-                <w:sz w:val="16"/>
-              </w:rPr>
-              <w:t>Record before study</w:t>
+            <w:r>
+              <w:t>028400516464</w:t>
             </w:r>
           </w:p>
         </w:tc>
@@ -2694,6 +2644,7 @@
       <w:tr>
         <w:trPr>
           <w:jc w:val="center"/>
+          <w:cantSplit/>
         </w:trPr>
         <w:tc>
           <w:tcPr>
@@ -2732,15 +2683,16 @@
             <w:vAlign w:val="center"/>
           </w:tcPr>
           <w:p>
-            <w:pPr>
-              <w:spacing w:after="40"/>
-            </w:pPr>
-            <w:r>
-              <w:rPr>
-                <w:sz w:val="16"/>
-              </w:rPr>
-              <w:t>Campbell's Condensed Chicken Noodle Soup</w:t>
-            </w:r>
+            <w:r/>
+            <w:hyperlink r:id="rId25">
+              <w:r>
+                <w:rPr>
+                  <w:color w:val="0563C1"/>
+                  <w:u w:val="single"/>
+                </w:rPr>
+                <w:t>Campbell's Condensed Chicken Noodle Soup, 10.75 oz can</w:t>
+              </w:r>
+            </w:hyperlink>
           </w:p>
         </w:tc>
         <w:tc>
@@ -2787,7 +2739,7 @@
               <w:rPr>
                 <w:sz w:val="16"/>
               </w:rPr>
-              <w:t>Higher sodium</w:t>
+              <w:t>Likely not approved; Higher sodium</w:t>
             </w:r>
           </w:p>
         </w:tc>
@@ -2804,14 +2756,8 @@
             <w:vAlign w:val="center"/>
           </w:tcPr>
           <w:p>
-            <w:pPr>
-              <w:spacing w:after="40"/>
-            </w:pPr>
-            <w:r>
-              <w:rPr>
-                <w:sz w:val="16"/>
-              </w:rPr>
-              <w:t>Record before study</w:t>
+            <w:r>
+              <w:t>051000012517</w:t>
             </w:r>
           </w:p>
         </w:tc>
@@ -2819,6 +2765,7 @@
       <w:tr>
         <w:trPr>
           <w:jc w:val="center"/>
+          <w:cantSplit/>
         </w:trPr>
         <w:tc>
           <w:tcPr>
@@ -2855,6 +2802,30 @@
             <w:vAlign w:val="center"/>
           </w:tcPr>
           <w:p>
+            <w:r/>
+            <w:hyperlink r:id="rId26">
+              <w:r>
+                <w:rPr>
+                  <w:color w:val="0563C1"/>
+                  <w:u w:val="single"/>
+                </w:rPr>
+                <w:t>Kraft Original Macaroni &amp; Cheese, 7.25 oz box</w:t>
+              </w:r>
+            </w:hyperlink>
+          </w:p>
+        </w:tc>
+        <w:tc>
+          <w:tcPr>
+            <w:tcW w:w="1550" w:type="dxa"/>
+            <w:tcMar>
+              <w:top w:w="80" w:type="dxa"/>
+              <w:left w:w="120" w:type="dxa"/>
+              <w:bottom w:w="80" w:type="dxa"/>
+              <w:right w:w="120" w:type="dxa"/>
+            </w:tcMar>
+            <w:vAlign w:val="center"/>
+          </w:tcPr>
+          <w:p>
             <w:pPr>
               <w:spacing w:after="40"/>
             </w:pPr>
@@ -2862,13 +2833,13 @@
               <w:rPr>
                 <w:sz w:val="16"/>
               </w:rPr>
-              <w:t>Kraft Original Macaroni &amp; Cheese</w:t>
-            </w:r>
-          </w:p>
-        </w:tc>
-        <w:tc>
-          <w:tcPr>
-            <w:tcW w:w="1550" w:type="dxa"/>
+              <w:t>Meal</w:t>
+            </w:r>
+          </w:p>
+        </w:tc>
+        <w:tc>
+          <w:tcPr>
+            <w:tcW w:w="2760" w:type="dxa"/>
             <w:tcMar>
               <w:top w:w="80" w:type="dxa"/>
               <w:left w:w="120" w:type="dxa"/>
@@ -2885,30 +2856,7 @@
               <w:rPr>
                 <w:sz w:val="16"/>
               </w:rPr>
-              <w:t>Meal</w:t>
-            </w:r>
-          </w:p>
-        </w:tc>
-        <w:tc>
-          <w:tcPr>
-            <w:tcW w:w="2760" w:type="dxa"/>
-            <w:tcMar>
-              <w:top w:w="80" w:type="dxa"/>
-              <w:left w:w="120" w:type="dxa"/>
-              <w:bottom w:w="80" w:type="dxa"/>
-              <w:right w:w="120" w:type="dxa"/>
-            </w:tcMar>
-            <w:vAlign w:val="center"/>
-          </w:tcPr>
-          <w:p>
-            <w:pPr>
-              <w:spacing w:after="40"/>
-            </w:pPr>
-            <w:r>
-              <w:rPr>
-                <w:sz w:val="16"/>
-              </w:rPr>
-              <w:t>Prepared food / additives</w:t>
+              <w:t>Likely not approved; Prepared food / additives</w:t>
             </w:r>
           </w:p>
         </w:tc>
@@ -2924,14 +2872,8 @@
             <w:vAlign w:val="center"/>
           </w:tcPr>
           <w:p>
-            <w:pPr>
-              <w:spacing w:after="40"/>
-            </w:pPr>
-            <w:r>
-              <w:rPr>
-                <w:sz w:val="16"/>
-              </w:rPr>
-              <w:t>Record before study</w:t>
+            <w:r>
+              <w:t>021000658831</w:t>
             </w:r>
           </w:p>
         </w:tc>
@@ -2939,6 +2881,7 @@
       <w:tr>
         <w:trPr>
           <w:jc w:val="center"/>
+          <w:cantSplit/>
         </w:trPr>
         <w:tc>
           <w:tcPr>
@@ -2977,15 +2920,16 @@
             <w:vAlign w:val="center"/>
           </w:tcPr>
           <w:p>
-            <w:pPr>
-              <w:spacing w:after="40"/>
-            </w:pPr>
-            <w:r>
-              <w:rPr>
-                <w:sz w:val="16"/>
-              </w:rPr>
-              <w:t>Nature Valley Oats 'n Honey Bars</w:t>
-            </w:r>
+            <w:r/>
+            <w:hyperlink r:id="rId27">
+              <w:r>
+                <w:rPr>
+                  <w:color w:val="0563C1"/>
+                  <w:u w:val="single"/>
+                </w:rPr>
+                <w:t>LARABAR Cashew Cookie, 1.7 oz bar</w:t>
+              </w:r>
+            </w:hyperlink>
           </w:p>
         </w:tc>
         <w:tc>
@@ -3032,7 +2976,7 @@
               <w:rPr>
                 <w:sz w:val="16"/>
               </w:rPr>
-              <w:t>Added sugar / whole grain</w:t>
+              <w:t>Likely approved; Cashews and dates / no added sugar</w:t>
             </w:r>
           </w:p>
         </w:tc>
@@ -3049,14 +2993,8 @@
             <w:vAlign w:val="center"/>
           </w:tcPr>
           <w:p>
-            <w:pPr>
-              <w:spacing w:after="40"/>
-            </w:pPr>
-            <w:r>
-              <w:rPr>
-                <w:sz w:val="16"/>
-              </w:rPr>
-              <w:t>Record before study</w:t>
+            <w:r>
+              <w:t>021908509259</w:t>
             </w:r>
           </w:p>
         </w:tc>
@@ -3064,6 +3002,7 @@
       <w:tr>
         <w:trPr>
           <w:jc w:val="center"/>
+          <w:cantSplit/>
         </w:trPr>
         <w:tc>
           <w:tcPr>
@@ -3100,6 +3039,30 @@
             <w:vAlign w:val="center"/>
           </w:tcPr>
           <w:p>
+            <w:r/>
+            <w:hyperlink r:id="rId28">
+              <w:r>
+                <w:rPr>
+                  <w:color w:val="0563C1"/>
+                  <w:u w:val="single"/>
+                </w:rPr>
+                <w:t>Eden Organic Black Beans No Salt Added, 15 oz can</w:t>
+              </w:r>
+            </w:hyperlink>
+          </w:p>
+        </w:tc>
+        <w:tc>
+          <w:tcPr>
+            <w:tcW w:w="1550" w:type="dxa"/>
+            <w:tcMar>
+              <w:top w:w="80" w:type="dxa"/>
+              <w:left w:w="120" w:type="dxa"/>
+              <w:bottom w:w="80" w:type="dxa"/>
+              <w:right w:w="120" w:type="dxa"/>
+            </w:tcMar>
+            <w:vAlign w:val="center"/>
+          </w:tcPr>
+          <w:p>
             <w:pPr>
               <w:spacing w:after="40"/>
             </w:pPr>
@@ -3107,13 +3070,13 @@
               <w:rPr>
                 <w:sz w:val="16"/>
               </w:rPr>
-              <w:t>KIND Dark Chocolate Nuts &amp; Sea Salt Bar</w:t>
-            </w:r>
-          </w:p>
-        </w:tc>
-        <w:tc>
-          <w:tcPr>
-            <w:tcW w:w="1550" w:type="dxa"/>
+              <w:t>Canned beans</w:t>
+            </w:r>
+          </w:p>
+        </w:tc>
+        <w:tc>
+          <w:tcPr>
+            <w:tcW w:w="2760" w:type="dxa"/>
             <w:tcMar>
               <w:top w:w="80" w:type="dxa"/>
               <w:left w:w="120" w:type="dxa"/>
@@ -3130,30 +3093,7 @@
               <w:rPr>
                 <w:sz w:val="16"/>
               </w:rPr>
-              <w:t>Snack bar</w:t>
-            </w:r>
-          </w:p>
-        </w:tc>
-        <w:tc>
-          <w:tcPr>
-            <w:tcW w:w="2760" w:type="dxa"/>
-            <w:tcMar>
-              <w:top w:w="80" w:type="dxa"/>
-              <w:left w:w="120" w:type="dxa"/>
-              <w:bottom w:w="80" w:type="dxa"/>
-              <w:right w:w="120" w:type="dxa"/>
-            </w:tcMar>
-            <w:vAlign w:val="center"/>
-          </w:tcPr>
-          <w:p>
-            <w:pPr>
-              <w:spacing w:after="40"/>
-            </w:pPr>
-            <w:r>
-              <w:rPr>
-                <w:sz w:val="16"/>
-              </w:rPr>
-              <w:t>Nuts / sweetener</w:t>
+              <w:t>Likely approved; Plant protein / no added salt</w:t>
             </w:r>
           </w:p>
         </w:tc>
@@ -3169,14 +3109,8 @@
             <w:vAlign w:val="center"/>
           </w:tcPr>
           <w:p>
-            <w:pPr>
-              <w:spacing w:after="40"/>
-            </w:pPr>
-            <w:r>
-              <w:rPr>
-                <w:sz w:val="16"/>
-              </w:rPr>
-              <w:t>Record before study</w:t>
+            <w:r>
+              <w:t>024182002539</w:t>
             </w:r>
           </w:p>
         </w:tc>
@@ -3184,6 +3118,7 @@
       <w:tr>
         <w:trPr>
           <w:jc w:val="center"/>
+          <w:cantSplit/>
         </w:trPr>
         <w:tc>
           <w:tcPr>
@@ -3222,15 +3157,16 @@
             <w:vAlign w:val="center"/>
           </w:tcPr>
           <w:p>
-            <w:pPr>
-              <w:spacing w:after="40"/>
-            </w:pPr>
-            <w:r>
-              <w:rPr>
-                <w:sz w:val="16"/>
-              </w:rPr>
-              <w:t>Oreo Original Cookies</w:t>
-            </w:r>
+            <w:r/>
+            <w:hyperlink r:id="rId29">
+              <w:r>
+                <w:rPr>
+                  <w:color w:val="0563C1"/>
+                  <w:u w:val="single"/>
+                </w:rPr>
+                <w:t>OREO Original Chocolate Sandwich Cookies, 13.29 oz</w:t>
+              </w:r>
+            </w:hyperlink>
           </w:p>
         </w:tc>
         <w:tc>
@@ -3277,7 +3213,7 @@
               <w:rPr>
                 <w:sz w:val="16"/>
               </w:rPr>
-              <w:t>Processed snack</w:t>
+              <w:t>Likely not approved; Processed snack</w:t>
             </w:r>
           </w:p>
         </w:tc>
@@ -3294,14 +3230,8 @@
             <w:vAlign w:val="center"/>
           </w:tcPr>
           <w:p>
-            <w:pPr>
-              <w:spacing w:after="40"/>
-            </w:pPr>
-            <w:r>
-              <w:rPr>
-                <w:sz w:val="16"/>
-              </w:rPr>
-              <w:t>Record before study</w:t>
+            <w:r>
+              <w:t>044000060114</w:t>
             </w:r>
           </w:p>
         </w:tc>
@@ -3309,6 +3239,7 @@
       <w:tr>
         <w:trPr>
           <w:jc w:val="center"/>
+          <w:cantSplit/>
         </w:trPr>
         <w:tc>
           <w:tcPr>
@@ -3345,6 +3276,30 @@
             <w:vAlign w:val="center"/>
           </w:tcPr>
           <w:p>
+            <w:r/>
+            <w:hyperlink r:id="rId30">
+              <w:r>
+                <w:rPr>
+                  <w:color w:val="0563C1"/>
+                  <w:u w:val="single"/>
+                </w:rPr>
+                <w:t>Elmhurst Unsweetened Milked Almonds, 32 fl oz carton</w:t>
+              </w:r>
+            </w:hyperlink>
+          </w:p>
+        </w:tc>
+        <w:tc>
+          <w:tcPr>
+            <w:tcW w:w="1550" w:type="dxa"/>
+            <w:tcMar>
+              <w:top w:w="80" w:type="dxa"/>
+              <w:left w:w="120" w:type="dxa"/>
+              <w:bottom w:w="80" w:type="dxa"/>
+              <w:right w:w="120" w:type="dxa"/>
+            </w:tcMar>
+            <w:vAlign w:val="center"/>
+          </w:tcPr>
+          <w:p>
             <w:pPr>
               <w:spacing w:after="40"/>
             </w:pPr>
@@ -3352,13 +3307,13 @@
               <w:rPr>
                 <w:sz w:val="16"/>
               </w:rPr>
-              <w:t>Almond Breeze Unsweetened Original Almondmilk</w:t>
-            </w:r>
-          </w:p>
-        </w:tc>
-        <w:tc>
-          <w:tcPr>
-            <w:tcW w:w="1550" w:type="dxa"/>
+              <w:t>Plant beverage</w:t>
+            </w:r>
+          </w:p>
+        </w:tc>
+        <w:tc>
+          <w:tcPr>
+            <w:tcW w:w="2760" w:type="dxa"/>
             <w:tcMar>
               <w:top w:w="80" w:type="dxa"/>
               <w:left w:w="120" w:type="dxa"/>
@@ -3375,30 +3330,7 @@
               <w:rPr>
                 <w:sz w:val="16"/>
               </w:rPr>
-              <w:t>Plant beverage</w:t>
-            </w:r>
-          </w:p>
-        </w:tc>
-        <w:tc>
-          <w:tcPr>
-            <w:tcW w:w="2760" w:type="dxa"/>
-            <w:tcMar>
-              <w:top w:w="80" w:type="dxa"/>
-              <w:left w:w="120" w:type="dxa"/>
-              <w:bottom w:w="80" w:type="dxa"/>
-              <w:right w:w="120" w:type="dxa"/>
-            </w:tcMar>
-            <w:vAlign w:val="center"/>
-          </w:tcPr>
-          <w:p>
-            <w:pPr>
-              <w:spacing w:after="40"/>
-            </w:pPr>
-            <w:r>
-              <w:rPr>
-                <w:sz w:val="16"/>
-              </w:rPr>
-              <w:t>Fortification / additives</w:t>
+              <w:t>Likely approved; Two ingredients / no added sugar</w:t>
             </w:r>
           </w:p>
         </w:tc>
@@ -3414,14 +3346,8 @@
             <w:vAlign w:val="center"/>
           </w:tcPr>
           <w:p>
-            <w:pPr>
-              <w:spacing w:after="40"/>
-            </w:pPr>
-            <w:r>
-              <w:rPr>
-                <w:sz w:val="16"/>
-              </w:rPr>
-              <w:t>Record before study</w:t>
+            <w:r>
+              <w:t>018944001021</w:t>
             </w:r>
           </w:p>
         </w:tc>
@@ -3429,6 +3355,7 @@
       <w:tr>
         <w:trPr>
           <w:jc w:val="center"/>
+          <w:cantSplit/>
         </w:trPr>
         <w:tc>
           <w:tcPr>
@@ -3467,15 +3394,16 @@
             <w:vAlign w:val="center"/>
           </w:tcPr>
           <w:p>
-            <w:pPr>
-              <w:spacing w:after="40"/>
-            </w:pPr>
-            <w:r>
-              <w:rPr>
-                <w:sz w:val="16"/>
-              </w:rPr>
-              <w:t>Impossible Burger Plant-Based Patties</w:t>
-            </w:r>
+            <w:r/>
+            <w:hyperlink r:id="rId31">
+              <w:r>
+                <w:rPr>
+                  <w:color w:val="0563C1"/>
+                  <w:u w:val="single"/>
+                </w:rPr>
+                <w:t>Birds Eye Steamfresh Broccoli Florets, 10.8 oz bag</w:t>
+              </w:r>
+            </w:hyperlink>
           </w:p>
         </w:tc>
         <w:tc>
@@ -3498,7 +3426,7 @@
               <w:rPr>
                 <w:sz w:val="16"/>
               </w:rPr>
-              <w:t>Meat alternative</w:t>
+              <w:t>Frozen vegetable</w:t>
             </w:r>
           </w:p>
         </w:tc>
@@ -3522,7 +3450,7 @@
               <w:rPr>
                 <w:sz w:val="16"/>
               </w:rPr>
-              <w:t>Long formulation / protein</w:t>
+              <w:t>Likely approved; Plain vegetables / no sauce</w:t>
             </w:r>
           </w:p>
         </w:tc>
@@ -3539,14 +3467,8 @@
             <w:vAlign w:val="center"/>
           </w:tcPr>
           <w:p>
-            <w:pPr>
-              <w:spacing w:after="40"/>
-            </w:pPr>
-            <w:r>
-              <w:rPr>
-                <w:sz w:val="16"/>
-              </w:rPr>
-              <w:t>Record before study</w:t>
+            <w:r>
+              <w:t>014500021830</w:t>
             </w:r>
           </w:p>
         </w:tc>
@@ -3597,6 +3519,7 @@
         <w:trPr>
           <w:tblHeader/>
           <w:jc w:val="center"/>
+          <w:cantSplit/>
         </w:trPr>
         <w:tc>
           <w:tcPr>
@@ -3732,6 +3655,7 @@
       <w:tr>
         <w:trPr>
           <w:jc w:val="center"/>
+          <w:cantSplit/>
         </w:trPr>
         <w:tc>
           <w:tcPr>
@@ -3852,6 +3776,7 @@
       <w:tr>
         <w:trPr>
           <w:jc w:val="center"/>
+          <w:cantSplit/>
         </w:trPr>
         <w:tc>
           <w:tcPr>
@@ -3977,6 +3902,7 @@
       <w:tr>
         <w:trPr>
           <w:jc w:val="center"/>
+          <w:cantSplit/>
         </w:trPr>
         <w:tc>
           <w:tcPr>
@@ -4097,6 +4023,7 @@
       <w:tr>
         <w:trPr>
           <w:jc w:val="center"/>
+          <w:cantSplit/>
         </w:trPr>
         <w:tc>
           <w:tcPr>
@@ -4349,6 +4276,7 @@
         <w:rPr>
           <w:color w:val="auto"/>
         </w:rPr>
+        <w:keepNext/>
       </w:pPr>
       <w:r>
         <w:rPr>
@@ -4455,6 +4383,7 @@
         <w:trPr>
           <w:tblHeader/>
           <w:jc w:val="center"/>
+          <w:cantSplit/>
         </w:trPr>
         <w:tc>
           <w:tcPr>
@@ -4590,6 +4519,7 @@
       <w:tr>
         <w:trPr>
           <w:jc w:val="center"/>
+          <w:cantSplit/>
         </w:trPr>
         <w:tc>
           <w:tcPr>
@@ -4711,6 +4641,7 @@
       <w:tr>
         <w:trPr>
           <w:jc w:val="center"/>
+          <w:cantSplit/>
         </w:trPr>
         <w:tc>
           <w:tcPr>
@@ -4836,6 +4767,7 @@
       <w:tr>
         <w:trPr>
           <w:jc w:val="center"/>
+          <w:cantSplit/>
         </w:trPr>
         <w:tc>
           <w:tcPr>
@@ -4956,6 +4888,7 @@
       <w:tr>
         <w:trPr>
           <w:jc w:val="center"/>
+          <w:cantSplit/>
         </w:trPr>
         <w:tc>
           <w:tcPr>
@@ -5081,6 +5014,7 @@
       <w:tr>
         <w:trPr>
           <w:jc w:val="center"/>
+          <w:cantSplit/>
         </w:trPr>
         <w:tc>
           <w:tcPr>
@@ -5201,6 +5135,7 @@
       <w:tr>
         <w:trPr>
           <w:jc w:val="center"/>
+          <w:cantSplit/>
         </w:trPr>
         <w:tc>
           <w:tcPr>
@@ -5393,6 +5328,7 @@
         <w:trPr>
           <w:tblHeader/>
           <w:jc w:val="center"/>
+          <w:cantSplit/>
         </w:trPr>
         <w:tc>
           <w:tcPr>
@@ -5502,6 +5438,7 @@
       <w:tr>
         <w:trPr>
           <w:jc w:val="center"/>
+          <w:cantSplit/>
         </w:trPr>
         <w:tc>
           <w:tcPr>
@@ -5599,6 +5536,7 @@
       <w:tr>
         <w:trPr>
           <w:jc w:val="center"/>
+          <w:cantSplit/>
         </w:trPr>
         <w:tc>
           <w:tcPr>
@@ -5700,6 +5638,7 @@
       <w:tr>
         <w:trPr>
           <w:jc w:val="center"/>
+          <w:cantSplit/>
         </w:trPr>
         <w:tc>
           <w:tcPr>
@@ -5797,6 +5736,7 @@
       <w:tr>
         <w:trPr>
           <w:jc w:val="center"/>
+          <w:cantSplit/>
         </w:trPr>
         <w:tc>
           <w:tcPr>
@@ -5899,6 +5839,7 @@
       <w:tr>
         <w:trPr>
           <w:jc w:val="center"/>
+          <w:cantSplit/>
         </w:trPr>
         <w:tc>
           <w:tcPr>
@@ -6090,6 +6031,7 @@
         <w:rPr>
           <w:color w:val="auto"/>
         </w:rPr>
+        <w:keepNext/>
       </w:pPr>
       <w:r>
         <w:rPr>
@@ -6122,6 +6064,7 @@
         <w:trPr>
           <w:tblHeader/>
           <w:jc w:val="center"/>
+          <w:cantSplit/>
         </w:trPr>
         <w:tc>
           <w:tcPr>
@@ -6138,6 +6081,7 @@
           <w:p>
             <w:pPr>
               <w:spacing w:after="40"/>
+              <w:keepNext/>
             </w:pPr>
             <w:r>
               <w:rPr>
@@ -6164,6 +6108,7 @@
           <w:p>
             <w:pPr>
               <w:spacing w:after="40"/>
+              <w:keepNext/>
             </w:pPr>
             <w:r>
               <w:rPr>
@@ -6190,6 +6135,7 @@
           <w:p>
             <w:pPr>
               <w:spacing w:after="40"/>
+              <w:keepNext/>
             </w:pPr>
             <w:r>
               <w:rPr>
@@ -6205,6 +6151,7 @@
       <w:tr>
         <w:trPr>
           <w:jc w:val="center"/>
+          <w:cantSplit/>
         </w:trPr>
         <w:tc>
           <w:tcPr>
@@ -6279,6 +6226,7 @@
       <w:tr>
         <w:trPr>
           <w:jc w:val="center"/>
+          <w:cantSplit/>
         </w:trPr>
         <w:tc>
           <w:tcPr>
@@ -6356,6 +6304,7 @@
       <w:tr>
         <w:trPr>
           <w:jc w:val="center"/>
+          <w:cantSplit/>
         </w:trPr>
         <w:tc>
           <w:tcPr>
@@ -6430,6 +6379,7 @@
       <w:tr>
         <w:trPr>
           <w:jc w:val="center"/>
+          <w:cantSplit/>
         </w:trPr>
         <w:tc>
           <w:tcPr>
@@ -6507,6 +6457,7 @@
       <w:tr>
         <w:trPr>
           <w:jc w:val="center"/>
+          <w:cantSplit/>
         </w:trPr>
         <w:tc>
           <w:tcPr>
@@ -6581,6 +6532,7 @@
       <w:tr>
         <w:trPr>
           <w:jc w:val="center"/>
+          <w:cantSplit/>
         </w:trPr>
         <w:tc>
           <w:tcPr>
@@ -6658,6 +6610,7 @@
       <w:tr>
         <w:trPr>
           <w:jc w:val="center"/>
+          <w:cantSplit/>
         </w:trPr>
         <w:tc>
           <w:tcPr>
@@ -6732,6 +6685,7 @@
       <w:tr>
         <w:trPr>
           <w:jc w:val="center"/>
+          <w:cantSplit/>
         </w:trPr>
         <w:tc>
           <w:tcPr>
@@ -6809,6 +6763,7 @@
       <w:tr>
         <w:trPr>
           <w:jc w:val="center"/>
+          <w:cantSplit/>
         </w:trPr>
         <w:tc>
           <w:tcPr>
@@ -7045,6 +7000,7 @@
         <w:trPr>
           <w:tblHeader/>
           <w:jc w:val="center"/>
+          <w:cantSplit/>
         </w:trPr>
         <w:tc>
           <w:tcPr>
@@ -7102,6 +7058,7 @@
       <w:tr>
         <w:trPr>
           <w:jc w:val="center"/>
+          <w:cantSplit/>
         </w:trPr>
         <w:tc>
           <w:tcPr>
@@ -7153,6 +7110,7 @@
       <w:tr>
         <w:trPr>
           <w:jc w:val="center"/>
+          <w:cantSplit/>
         </w:trPr>
         <w:tc>
           <w:tcPr>
@@ -7206,6 +7164,7 @@
       <w:tr>
         <w:trPr>
           <w:jc w:val="center"/>
+          <w:cantSplit/>
         </w:trPr>
         <w:tc>
           <w:tcPr>
@@ -7264,6 +7223,7 @@
       <w:tr>
         <w:trPr>
           <w:jc w:val="center"/>
+          <w:cantSplit/>
         </w:trPr>
         <w:tc>
           <w:tcPr>
@@ -7318,6 +7278,7 @@
       <w:tr>
         <w:trPr>
           <w:jc w:val="center"/>
+          <w:cantSplit/>
         </w:trPr>
         <w:tc>
           <w:tcPr>
@@ -7369,6 +7330,7 @@
       <w:tr>
         <w:trPr>
           <w:jc w:val="center"/>
+          <w:cantSplit/>
         </w:trPr>
         <w:tc>
           <w:tcPr>

</xml_diff>